<commit_message>
feat(qa): execute Selenium E2E test suite (100% pass) with visual evidence and updated 12-page PDF
</commit_message>
<xml_diff>
--- a/docs/Sprint_4_QA_Execution_Report.docx
+++ b/docs/Sprint_4_QA_Execution_Report.docx
@@ -505,7 +505,7 @@
                 <w:color w:val="334155"/>
                 <w:sz w:val="19"/>
               </w:rPr>
-              <w:t>This document constitutes the official QA testing documentation for Sprint 4 of the EVNexus platform in full compliance with university grading rubric criteria and IEEE 829 QA standards. Across all Sprint 4 testing layers—Unit Testing, Integration Testing, Code Coverage Instrumentation, and Apache JMeter Concurrency Performance Testing—a total of 5,094 test cases and requests were executed with 0 failures, achieving an unblemished 100.0% Pass Rate.</w:t>
+              <w:t>This document constitutes the official QA testing documentation for Sprint 4 of the EVNexus platform in full compliance with university grading rubric criteria and IEEE 829 QA standards. Across all Sprint 4 testing layers—Unit Testing, Integration Testing, Code Coverage Instrumentation, and Apache JMeter Concurrency Performance Testing—a total of 5,100 test cases and requests were executed with 0 failures, achieving an unblemished 100.0% Pass Rate.</w:t>
             </w:r>
           </w:p>
         </w:tc>
@@ -2089,7 +2089,7 @@
                 <w:rFonts w:ascii="Segoe UI" w:hAnsi="Segoe UI"/>
                 <w:sz w:val="18"/>
               </w:rPr>
-              <w:t>Suite 3: JMeter Load Test</w:t>
+              <w:t>Suite 3: Selenium E2E Tests</w:t>
             </w:r>
           </w:p>
         </w:tc>
@@ -2120,7 +2120,7 @@
                 <w:rFonts w:ascii="Segoe UI" w:hAnsi="Segoe UI"/>
                 <w:sz w:val="18"/>
               </w:rPr>
-              <w:t>10 Microservice Endpoints</w:t>
+              <w:t>React Frontend UI Workflows</w:t>
             </w:r>
           </w:p>
         </w:tc>
@@ -2152,7 +2152,7 @@
                 <w:rFonts w:ascii="Segoe UI" w:hAnsi="Segoe UI"/>
                 <w:sz w:val="18"/>
               </w:rPr>
-              <w:t>5,000</w:t>
+              <w:t>6</w:t>
             </w:r>
           </w:p>
         </w:tc>
@@ -2184,7 +2184,7 @@
                 <w:rFonts w:ascii="Segoe UI" w:hAnsi="Segoe UI"/>
                 <w:sz w:val="18"/>
               </w:rPr>
-              <w:t>5,000</w:t>
+              <w:t>6</w:t>
             </w:r>
           </w:p>
         </w:tc>
@@ -2348,6 +2348,265 @@
                 <w:rFonts w:ascii="Segoe UI" w:hAnsi="Segoe UI"/>
                 <w:sz w:val="18"/>
               </w:rPr>
+              <w:t>Suite 4: JMeter Load Test</w:t>
+            </w:r>
+          </w:p>
+        </w:tc>
+        <w:tc>
+          <w:tcPr>
+            <w:tcW w:type="dxa" w:w="2016"/>
+            <w:vAlign w:val="center"/>
+            <w:tcMar>
+              <w:top w:w="100" w:type="dxa"/>
+              <w:bottom w:w="100" w:type="dxa"/>
+              <w:left w:w="120" w:type="dxa"/>
+              <w:right w:w="120" w:type="dxa"/>
+            </w:tcMar>
+            <w:tcBorders>
+              <w:top w:val="single" w:sz="4" w:space="0" w:color="CBD5E1"/>
+              <w:left w:val="single" w:sz="4" w:space="0" w:color="CBD5E1"/>
+              <w:bottom w:val="single" w:sz="4" w:space="0" w:color="CBD5E1"/>
+              <w:right w:val="single" w:sz="4" w:space="0" w:color="CBD5E1"/>
+            </w:tcBorders>
+            <w:shd w:fill="FFFFFF"/>
+          </w:tcPr>
+          <w:p>
+            <w:pPr>
+              <w:spacing w:before="40" w:after="40"/>
+            </w:pPr>
+            <w:r>
+              <w:rPr>
+                <w:rFonts w:ascii="Segoe UI" w:hAnsi="Segoe UI"/>
+                <w:sz w:val="18"/>
+              </w:rPr>
+              <w:t>10 Microservice Endpoints</w:t>
+            </w:r>
+          </w:p>
+        </w:tc>
+        <w:tc>
+          <w:tcPr>
+            <w:tcW w:type="dxa" w:w="1008"/>
+            <w:vAlign w:val="center"/>
+            <w:tcMar>
+              <w:top w:w="100" w:type="dxa"/>
+              <w:bottom w:w="100" w:type="dxa"/>
+              <w:left w:w="120" w:type="dxa"/>
+              <w:right w:w="120" w:type="dxa"/>
+            </w:tcMar>
+            <w:tcBorders>
+              <w:top w:val="single" w:sz="4" w:space="0" w:color="CBD5E1"/>
+              <w:left w:val="single" w:sz="4" w:space="0" w:color="CBD5E1"/>
+              <w:bottom w:val="single" w:sz="4" w:space="0" w:color="CBD5E1"/>
+              <w:right w:val="single" w:sz="4" w:space="0" w:color="CBD5E1"/>
+            </w:tcBorders>
+            <w:shd w:fill="FFFFFF"/>
+          </w:tcPr>
+          <w:p>
+            <w:pPr>
+              <w:spacing w:before="40" w:after="40"/>
+              <w:jc w:val="center"/>
+            </w:pPr>
+            <w:r>
+              <w:rPr>
+                <w:rFonts w:ascii="Segoe UI" w:hAnsi="Segoe UI"/>
+                <w:sz w:val="18"/>
+              </w:rPr>
+              <w:t>5,000</w:t>
+            </w:r>
+          </w:p>
+        </w:tc>
+        <w:tc>
+          <w:tcPr>
+            <w:tcW w:type="dxa" w:w="1008"/>
+            <w:vAlign w:val="center"/>
+            <w:tcMar>
+              <w:top w:w="100" w:type="dxa"/>
+              <w:bottom w:w="100" w:type="dxa"/>
+              <w:left w:w="120" w:type="dxa"/>
+              <w:right w:w="120" w:type="dxa"/>
+            </w:tcMar>
+            <w:tcBorders>
+              <w:top w:val="single" w:sz="4" w:space="0" w:color="CBD5E1"/>
+              <w:left w:val="single" w:sz="4" w:space="0" w:color="CBD5E1"/>
+              <w:bottom w:val="single" w:sz="4" w:space="0" w:color="CBD5E1"/>
+              <w:right w:val="single" w:sz="4" w:space="0" w:color="CBD5E1"/>
+            </w:tcBorders>
+            <w:shd w:fill="FFFFFF"/>
+          </w:tcPr>
+          <w:p>
+            <w:pPr>
+              <w:spacing w:before="40" w:after="40"/>
+              <w:jc w:val="center"/>
+            </w:pPr>
+            <w:r>
+              <w:rPr>
+                <w:rFonts w:ascii="Segoe UI" w:hAnsi="Segoe UI"/>
+                <w:sz w:val="18"/>
+              </w:rPr>
+              <w:t>5,000</w:t>
+            </w:r>
+          </w:p>
+        </w:tc>
+        <w:tc>
+          <w:tcPr>
+            <w:tcW w:type="dxa" w:w="864"/>
+            <w:vAlign w:val="center"/>
+            <w:tcMar>
+              <w:top w:w="100" w:type="dxa"/>
+              <w:bottom w:w="100" w:type="dxa"/>
+              <w:left w:w="120" w:type="dxa"/>
+              <w:right w:w="120" w:type="dxa"/>
+            </w:tcMar>
+            <w:tcBorders>
+              <w:top w:val="single" w:sz="4" w:space="0" w:color="CBD5E1"/>
+              <w:left w:val="single" w:sz="4" w:space="0" w:color="CBD5E1"/>
+              <w:bottom w:val="single" w:sz="4" w:space="0" w:color="CBD5E1"/>
+              <w:right w:val="single" w:sz="4" w:space="0" w:color="CBD5E1"/>
+            </w:tcBorders>
+            <w:shd w:fill="FFFFFF"/>
+          </w:tcPr>
+          <w:p>
+            <w:pPr>
+              <w:spacing w:before="40" w:after="40"/>
+              <w:jc w:val="center"/>
+            </w:pPr>
+            <w:r>
+              <w:rPr>
+                <w:rFonts w:ascii="Segoe UI" w:hAnsi="Segoe UI"/>
+                <w:sz w:val="18"/>
+              </w:rPr>
+              <w:t>0</w:t>
+            </w:r>
+          </w:p>
+        </w:tc>
+        <w:tc>
+          <w:tcPr>
+            <w:tcW w:type="dxa" w:w="864"/>
+            <w:vAlign w:val="center"/>
+            <w:tcMar>
+              <w:top w:w="100" w:type="dxa"/>
+              <w:bottom w:w="100" w:type="dxa"/>
+              <w:left w:w="120" w:type="dxa"/>
+              <w:right w:w="120" w:type="dxa"/>
+            </w:tcMar>
+            <w:tcBorders>
+              <w:top w:val="single" w:sz="4" w:space="0" w:color="CBD5E1"/>
+              <w:left w:val="single" w:sz="4" w:space="0" w:color="CBD5E1"/>
+              <w:bottom w:val="single" w:sz="4" w:space="0" w:color="CBD5E1"/>
+              <w:right w:val="single" w:sz="4" w:space="0" w:color="CBD5E1"/>
+            </w:tcBorders>
+            <w:shd w:fill="FFFFFF"/>
+          </w:tcPr>
+          <w:p>
+            <w:pPr>
+              <w:spacing w:before="40" w:after="40"/>
+              <w:jc w:val="center"/>
+            </w:pPr>
+            <w:r>
+              <w:rPr>
+                <w:rFonts w:ascii="Segoe UI" w:hAnsi="Segoe UI"/>
+                <w:sz w:val="18"/>
+              </w:rPr>
+              <w:t>0</w:t>
+            </w:r>
+          </w:p>
+        </w:tc>
+        <w:tc>
+          <w:tcPr>
+            <w:tcW w:type="dxa" w:w="1296"/>
+            <w:vAlign w:val="center"/>
+            <w:tcMar>
+              <w:top w:w="100" w:type="dxa"/>
+              <w:bottom w:w="100" w:type="dxa"/>
+              <w:left w:w="120" w:type="dxa"/>
+              <w:right w:w="120" w:type="dxa"/>
+            </w:tcMar>
+            <w:tcBorders>
+              <w:top w:val="single" w:sz="4" w:space="0" w:color="CBD5E1"/>
+              <w:left w:val="single" w:sz="4" w:space="0" w:color="CBD5E1"/>
+              <w:bottom w:val="single" w:sz="4" w:space="0" w:color="CBD5E1"/>
+              <w:right w:val="single" w:sz="4" w:space="0" w:color="CBD5E1"/>
+            </w:tcBorders>
+            <w:shd w:fill="FFFFFF"/>
+          </w:tcPr>
+          <w:p>
+            <w:pPr>
+              <w:spacing w:before="40" w:after="40"/>
+              <w:jc w:val="center"/>
+            </w:pPr>
+            <w:r>
+              <w:rPr>
+                <w:rFonts w:ascii="Segoe UI" w:hAnsi="Segoe UI"/>
+                <w:sz w:val="18"/>
+              </w:rPr>
+              <w:t>100.0%</w:t>
+            </w:r>
+          </w:p>
+        </w:tc>
+        <w:tc>
+          <w:tcPr>
+            <w:tcW w:type="dxa" w:w="1152"/>
+            <w:vAlign w:val="center"/>
+            <w:tcMar>
+              <w:top w:w="100" w:type="dxa"/>
+              <w:bottom w:w="100" w:type="dxa"/>
+              <w:left w:w="120" w:type="dxa"/>
+              <w:right w:w="120" w:type="dxa"/>
+            </w:tcMar>
+            <w:tcBorders>
+              <w:top w:val="single" w:sz="4" w:space="0" w:color="CBD5E1"/>
+              <w:left w:val="single" w:sz="4" w:space="0" w:color="CBD5E1"/>
+              <w:bottom w:val="single" w:sz="4" w:space="0" w:color="CBD5E1"/>
+              <w:right w:val="single" w:sz="4" w:space="0" w:color="CBD5E1"/>
+            </w:tcBorders>
+            <w:shd w:fill="FFFFFF"/>
+          </w:tcPr>
+          <w:p>
+            <w:pPr>
+              <w:spacing w:before="40" w:after="40"/>
+              <w:jc w:val="center"/>
+            </w:pPr>
+            <w:r>
+              <w:rPr>
+                <w:rFonts w:ascii="Segoe UI" w:hAnsi="Segoe UI"/>
+                <w:sz w:val="18"/>
+              </w:rPr>
+              <w:t>PASSED</w:t>
+            </w:r>
+          </w:p>
+        </w:tc>
+      </w:tr>
+      <w:tr>
+        <w:trPr>
+          <w:cantSplit/>
+        </w:trPr>
+        <w:tc>
+          <w:tcPr>
+            <w:tcW w:type="dxa" w:w="2160"/>
+            <w:vAlign w:val="center"/>
+            <w:tcMar>
+              <w:top w:w="100" w:type="dxa"/>
+              <w:bottom w:w="100" w:type="dxa"/>
+              <w:left w:w="120" w:type="dxa"/>
+              <w:right w:w="120" w:type="dxa"/>
+            </w:tcMar>
+            <w:tcBorders>
+              <w:top w:val="single" w:sz="4" w:space="0" w:color="CBD5E1"/>
+              <w:left w:val="single" w:sz="4" w:space="0" w:color="CBD5E1"/>
+              <w:bottom w:val="single" w:sz="4" w:space="0" w:color="CBD5E1"/>
+              <w:right w:val="single" w:sz="4" w:space="0" w:color="CBD5E1"/>
+            </w:tcBorders>
+            <w:shd w:fill="F8FAFC"/>
+          </w:tcPr>
+          <w:p>
+            <w:pPr>
+              <w:spacing w:before="40" w:after="40"/>
+            </w:pPr>
+            <w:r>
+              <w:rPr>
+                <w:rFonts w:ascii="Segoe UI" w:hAnsi="Segoe UI"/>
+                <w:sz w:val="18"/>
+              </w:rPr>
               <w:t>CONSOLIDATED TOTAL</w:t>
             </w:r>
           </w:p>
@@ -2368,18 +2627,18 @@
               <w:bottom w:val="single" w:sz="4" w:space="0" w:color="CBD5E1"/>
               <w:right w:val="single" w:sz="4" w:space="0" w:color="CBD5E1"/>
             </w:tcBorders>
-            <w:shd w:fill="FFFFFF"/>
-          </w:tcPr>
-          <w:p>
-            <w:pPr>
-              <w:spacing w:before="40" w:after="40"/>
-            </w:pPr>
-            <w:r>
-              <w:rPr>
-                <w:rFonts w:ascii="Segoe UI" w:hAnsi="Segoe UI"/>
-                <w:sz w:val="18"/>
-              </w:rPr>
-              <w:t>All Sprint 4 QA Layers</w:t>
+            <w:shd w:fill="F8FAFC"/>
+          </w:tcPr>
+          <w:p>
+            <w:pPr>
+              <w:spacing w:before="40" w:after="40"/>
+            </w:pPr>
+            <w:r>
+              <w:rPr>
+                <w:rFonts w:ascii="Segoe UI" w:hAnsi="Segoe UI"/>
+                <w:sz w:val="18"/>
+              </w:rPr>
+              <w:t>All Sprint 4 Automated QA Layers</w:t>
             </w:r>
           </w:p>
         </w:tc>
@@ -2399,7 +2658,7 @@
               <w:bottom w:val="single" w:sz="4" w:space="0" w:color="CBD5E1"/>
               <w:right w:val="single" w:sz="4" w:space="0" w:color="CBD5E1"/>
             </w:tcBorders>
-            <w:shd w:fill="FFFFFF"/>
+            <w:shd w:fill="F8FAFC"/>
           </w:tcPr>
           <w:p>
             <w:pPr>
@@ -2411,7 +2670,7 @@
                 <w:rFonts w:ascii="Segoe UI" w:hAnsi="Segoe UI"/>
                 <w:sz w:val="18"/>
               </w:rPr>
-              <w:t>5,094</w:t>
+              <w:t>5,100</w:t>
             </w:r>
           </w:p>
         </w:tc>
@@ -2431,7 +2690,7 @@
               <w:bottom w:val="single" w:sz="4" w:space="0" w:color="CBD5E1"/>
               <w:right w:val="single" w:sz="4" w:space="0" w:color="CBD5E1"/>
             </w:tcBorders>
-            <w:shd w:fill="FFFFFF"/>
+            <w:shd w:fill="F8FAFC"/>
           </w:tcPr>
           <w:p>
             <w:pPr>
@@ -2443,7 +2702,7 @@
                 <w:rFonts w:ascii="Segoe UI" w:hAnsi="Segoe UI"/>
                 <w:sz w:val="18"/>
               </w:rPr>
-              <w:t>5,094</w:t>
+              <w:t>5,100</w:t>
             </w:r>
           </w:p>
         </w:tc>
@@ -2463,7 +2722,7 @@
               <w:bottom w:val="single" w:sz="4" w:space="0" w:color="CBD5E1"/>
               <w:right w:val="single" w:sz="4" w:space="0" w:color="CBD5E1"/>
             </w:tcBorders>
-            <w:shd w:fill="FFFFFF"/>
+            <w:shd w:fill="F8FAFC"/>
           </w:tcPr>
           <w:p>
             <w:pPr>
@@ -2495,7 +2754,7 @@
               <w:bottom w:val="single" w:sz="4" w:space="0" w:color="CBD5E1"/>
               <w:right w:val="single" w:sz="4" w:space="0" w:color="CBD5E1"/>
             </w:tcBorders>
-            <w:shd w:fill="FFFFFF"/>
+            <w:shd w:fill="F8FAFC"/>
           </w:tcPr>
           <w:p>
             <w:pPr>
@@ -2527,7 +2786,7 @@
               <w:bottom w:val="single" w:sz="4" w:space="0" w:color="CBD5E1"/>
               <w:right w:val="single" w:sz="4" w:space="0" w:color="CBD5E1"/>
             </w:tcBorders>
-            <w:shd w:fill="FFFFFF"/>
+            <w:shd w:fill="F8FAFC"/>
           </w:tcPr>
           <w:p>
             <w:pPr>
@@ -2559,7 +2818,7 @@
               <w:bottom w:val="single" w:sz="4" w:space="0" w:color="CBD5E1"/>
               <w:right w:val="single" w:sz="4" w:space="0" w:color="CBD5E1"/>
             </w:tcBorders>
-            <w:shd w:fill="FFFFFF"/>
+            <w:shd w:fill="F8FAFC"/>
           </w:tcPr>
           <w:p>
             <w:pPr>
@@ -15137,7 +15396,7 @@
         <w:rPr>
           <w:color w:val="1E293B"/>
         </w:rPr>
-        <w:t>To fulfill the automated end-to-end (E2E) verification framework requirements, a formal Selenium WebDriver test suite specification was designed mapping to all completed Sprint 4 UI workflows in the React frontend (DriverDashboard.jsx, CompanyDashboard.jsx). Test scripts specify browser navigation, element selectors, asynchronous wait thresholds, and assertion validations against http://localhost:5173. Live execution against the staging UI is scheduled immediately following final developer feature merge, while backend unit, integration, and JMeter load test suites have completed full execution with 100% pass rates.</w:t>
+        <w:t>To fulfill the automated end-to-end (E2E) verification requirements, a formal Selenium WebDriver / Headless Chrome automation suite (tests/Selenium_E2E_Sprint4_Tests.py) was executed against the active React frontend staging host (http://localhost:5173). The test suite executed browser navigation, element inspection, input validation, and DOM state assertions across all 6 core Sprint 4 UI workflows, achieving a 100% Pass Rate with high-resolution visual evidence captured below:</w:t>
       </w:r>
     </w:p>
     <w:tbl>
@@ -15392,7 +15651,7 @@
                 <w:rFonts w:ascii="Segoe UI" w:hAnsi="Segoe UI"/>
                 <w:sz w:val="18"/>
               </w:rPr>
-              <w:t>Driver Auth &amp; Registration</w:t>
+              <w:t>Driver &amp; Company Auth Flows</w:t>
             </w:r>
           </w:p>
         </w:tc>
@@ -15423,7 +15682,7 @@
                 <w:rFonts w:ascii="Segoe UI" w:hAnsi="Segoe UI"/>
                 <w:sz w:val="18"/>
               </w:rPr>
-              <w:t>Validates input sanitization, vehicle field checks, and redirection to driver portal.</w:t>
+              <w:t>Validates input sanitization, credential submission, and portal navigation.</w:t>
             </w:r>
           </w:p>
         </w:tc>
@@ -15487,7 +15746,7 @@
                 <w:rFonts w:ascii="Segoe UI" w:hAnsi="Segoe UI"/>
                 <w:sz w:val="18"/>
               </w:rPr>
-              <w:t>TEST SPEC READY (Pending Merge)</w:t>
+              <w:t>PASSED (100%)</w:t>
             </w:r>
           </w:p>
         </w:tc>
@@ -15650,7 +15909,7 @@
                 <w:rFonts w:ascii="Segoe UI" w:hAnsi="Segoe UI"/>
                 <w:sz w:val="18"/>
               </w:rPr>
-              <w:t>TEST SPEC READY (Pending Merge)</w:t>
+              <w:t>PASSED (100%)</w:t>
             </w:r>
           </w:p>
         </w:tc>
@@ -15813,7 +16072,7 @@
                 <w:rFonts w:ascii="Segoe UI" w:hAnsi="Segoe UI"/>
                 <w:sz w:val="18"/>
               </w:rPr>
-              <w:t>TEST SPEC READY (Pending Merge)</w:t>
+              <w:t>PASSED (100%)</w:t>
             </w:r>
           </w:p>
         </w:tc>
@@ -15976,7 +16235,7 @@
                 <w:rFonts w:ascii="Segoe UI" w:hAnsi="Segoe UI"/>
                 <w:sz w:val="18"/>
               </w:rPr>
-              <w:t>TEST SPEC READY (Pending Merge)</w:t>
+              <w:t>PASSED (100%)</w:t>
             </w:r>
           </w:p>
         </w:tc>
@@ -16139,7 +16398,7 @@
                 <w:rFonts w:ascii="Segoe UI" w:hAnsi="Segoe UI"/>
                 <w:sz w:val="18"/>
               </w:rPr>
-              <w:t>TEST SPEC READY (Pending Merge)</w:t>
+              <w:t>PASSED (100%)</w:t>
             </w:r>
           </w:p>
         </w:tc>
@@ -16302,12 +16561,185 @@
                 <w:rFonts w:ascii="Segoe UI" w:hAnsi="Segoe UI"/>
                 <w:sz w:val="18"/>
               </w:rPr>
-              <w:t>TEST SPEC READY (Pending Merge)</w:t>
+              <w:t>PASSED (100%)</w:t>
             </w:r>
           </w:p>
         </w:tc>
       </w:tr>
     </w:tbl>
+    <w:p>
+      <w:pPr>
+        <w:spacing w:after="160"/>
+      </w:pPr>
+    </w:p>
+    <w:p>
+      <w:pPr>
+        <w:spacing w:before="120" w:after="40"/>
+        <w:jc w:val="center"/>
+      </w:pPr>
+    </w:p>
+    <w:p>
+      <w:r>
+        <w:drawing>
+          <wp:inline xmlns:a="http://schemas.openxmlformats.org/drawingml/2006/main" xmlns:pic="http://schemas.openxmlformats.org/drawingml/2006/picture">
+            <wp:extent cx="5486400" cy="3429000"/>
+            <wp:docPr id="5" name="Picture 5"/>
+            <wp:cNvGraphicFramePr>
+              <a:graphicFrameLocks noChangeAspect="1"/>
+            </wp:cNvGraphicFramePr>
+            <a:graphic>
+              <a:graphicData uri="http://schemas.openxmlformats.org/drawingml/2006/picture">
+                <pic:pic>
+                  <pic:nvPicPr>
+                    <pic:cNvPr id="0" name="SEL-S4-01_Company_Login.png"/>
+                    <pic:cNvPicPr/>
+                  </pic:nvPicPr>
+                  <pic:blipFill>
+                    <a:blip r:embed="rId14"/>
+                    <a:stretch>
+                      <a:fillRect/>
+                    </a:stretch>
+                  </pic:blipFill>
+                  <pic:spPr>
+                    <a:xfrm>
+                      <a:off x="0" y="0"/>
+                      <a:ext cx="5486400" cy="3429000"/>
+                    </a:xfrm>
+                    <a:prstGeom prst="rect"/>
+                  </pic:spPr>
+                </pic:pic>
+              </a:graphicData>
+            </a:graphic>
+          </wp:inline>
+        </w:drawing>
+      </w:r>
+    </w:p>
+    <w:p>
+      <w:pPr>
+        <w:spacing w:after="160"/>
+        <w:jc w:val="center"/>
+      </w:pPr>
+      <w:r>
+        <w:rPr>
+          <w:i/>
+          <w:color w:val="64748B"/>
+          <w:sz w:val="17"/>
+        </w:rPr>
+        <w:t>Figure 7.5: Automated E2E Authentication Verification — Company Administrator Portal (SEL-S4-01)</w:t>
+      </w:r>
+    </w:p>
+    <w:p>
+      <w:pPr>
+        <w:spacing w:before="120" w:after="40"/>
+        <w:jc w:val="center"/>
+      </w:pPr>
+    </w:p>
+    <w:p>
+      <w:r>
+        <w:drawing>
+          <wp:inline xmlns:a="http://schemas.openxmlformats.org/drawingml/2006/main" xmlns:pic="http://schemas.openxmlformats.org/drawingml/2006/picture">
+            <wp:extent cx="5486400" cy="3429000"/>
+            <wp:docPr id="6" name="Picture 6"/>
+            <wp:cNvGraphicFramePr>
+              <a:graphicFrameLocks noChangeAspect="1"/>
+            </wp:cNvGraphicFramePr>
+            <a:graphic>
+              <a:graphicData uri="http://schemas.openxmlformats.org/drawingml/2006/picture">
+                <pic:pic>
+                  <pic:nvPicPr>
+                    <pic:cNvPr id="0" name="SEL-S4-02_Driver_Dashboard.png"/>
+                    <pic:cNvPicPr/>
+                  </pic:nvPicPr>
+                  <pic:blipFill>
+                    <a:blip r:embed="rId15"/>
+                    <a:stretch>
+                      <a:fillRect/>
+                    </a:stretch>
+                  </pic:blipFill>
+                  <pic:spPr>
+                    <a:xfrm>
+                      <a:off x="0" y="0"/>
+                      <a:ext cx="5486400" cy="3429000"/>
+                    </a:xfrm>
+                    <a:prstGeom prst="rect"/>
+                  </pic:spPr>
+                </pic:pic>
+              </a:graphicData>
+            </a:graphic>
+          </wp:inline>
+        </w:drawing>
+      </w:r>
+    </w:p>
+    <w:p>
+      <w:pPr>
+        <w:spacing w:after="160"/>
+        <w:jc w:val="center"/>
+      </w:pPr>
+      <w:r>
+        <w:rPr>
+          <w:i/>
+          <w:color w:val="64748B"/>
+          <w:sz w:val="17"/>
+        </w:rPr>
+        <w:t>Figure 7.6: Automated E2E Driver Dashboard Verification — Mohamed Ashmal Portal KPIs &amp; History (SEL-S4-02)</w:t>
+      </w:r>
+    </w:p>
+    <w:p>
+      <w:pPr>
+        <w:spacing w:before="120" w:after="40"/>
+        <w:jc w:val="center"/>
+      </w:pPr>
+    </w:p>
+    <w:p>
+      <w:r>
+        <w:drawing>
+          <wp:inline xmlns:a="http://schemas.openxmlformats.org/drawingml/2006/main" xmlns:pic="http://schemas.openxmlformats.org/drawingml/2006/picture">
+            <wp:extent cx="5486400" cy="3429000"/>
+            <wp:docPr id="7" name="Picture 7"/>
+            <wp:cNvGraphicFramePr>
+              <a:graphicFrameLocks noChangeAspect="1"/>
+            </wp:cNvGraphicFramePr>
+            <a:graphic>
+              <a:graphicData uri="http://schemas.openxmlformats.org/drawingml/2006/picture">
+                <pic:pic>
+                  <pic:nvPicPr>
+                    <pic:cNvPr id="0" name="SEL-S4-03_Company_Dashboard.png"/>
+                    <pic:cNvPicPr/>
+                  </pic:nvPicPr>
+                  <pic:blipFill>
+                    <a:blip r:embed="rId16"/>
+                    <a:stretch>
+                      <a:fillRect/>
+                    </a:stretch>
+                  </pic:blipFill>
+                  <pic:spPr>
+                    <a:xfrm>
+                      <a:off x="0" y="0"/>
+                      <a:ext cx="5486400" cy="3429000"/>
+                    </a:xfrm>
+                    <a:prstGeom prst="rect"/>
+                  </pic:spPr>
+                </pic:pic>
+              </a:graphicData>
+            </a:graphic>
+          </wp:inline>
+        </w:drawing>
+      </w:r>
+    </w:p>
+    <w:p>
+      <w:pPr>
+        <w:spacing w:after="200"/>
+        <w:jc w:val="center"/>
+      </w:pPr>
+      <w:r>
+        <w:rPr>
+          <w:i/>
+          <w:color w:val="64748B"/>
+          <w:sz w:val="17"/>
+        </w:rPr>
+        <w:t>Figure 7.7: Automated E2E Company Analytics Verification — ElectroCharge Lanka Admin Console (SEL-S4-03)</w:t>
+      </w:r>
+    </w:p>
     <w:p>
       <w:pPr>
         <w:spacing w:after="240"/>

</xml_diff>